<commit_message>
Extended numbers cite out/extended sources; split long abstract sentences; scope the Q-learning claim
</commit_message>
<xml_diff>
--- a/report/report.docx
+++ b/report/report.docx
@@ -53,37 +53,37 @@
         <w:pStyle w:val="Abstract"/>
       </w:pPr>
       <w:r>
-        <w:t xml:space="preserve">Replacing a flagged pricing algorithm is an obvious remedy for collusion, and it breaks Q-learning cartels, whose</w:t>
-      </w:r>
-      <w:r>
-        <w:t xml:space="preserve"> </w:t>
-      </w:r>
-      <w:r>
-        <w:t xml:space="preserve">policies are fitted to their partners. The LLM agents studied here carry no learned state, only the price history in</w:t>
-      </w:r>
-      <w:r>
-        <w:t xml:space="preserve"> </w:t>
-      </w:r>
-      <w:r>
-        <w:t xml:space="preserve">their prompt, so replacing one may not restore competition. From six markets in the sprint's repeated Bertrand</w:t>
-      </w:r>
-      <w:r>
-        <w:t xml:space="preserve"> </w:t>
-      </w:r>
-      <w:r>
-        <w:t xml:space="preserve">duopoly that crossed a pre-registered high-price threshold (four gemini-2.5-flash markets and two qwen3-14b markets</w:t>
-      </w:r>
-      <w:r>
-        <w:t xml:space="preserve"> </w:t>
-      </w:r>
-      <w:r>
-        <w:t xml:space="preserve">instructed to cooperate), we ran matched 50-round continuations with one or both firms replaced, compared each with</w:t>
-      </w:r>
-      <w:r>
-        <w:t xml:space="preserve"> </w:t>
-      </w:r>
-      <w:r>
-        <w:t xml:space="preserve">a no-swap control from the same state, and scored the last 20 rounds. Replacing one firm with a same-family model,</w:t>
+        <w:t xml:space="preserve">Replacing a flagged pricing algorithm is an obvious remedy for collusion, and in simulations it breaks Q-learning</w:t>
+      </w:r>
+      <w:r>
+        <w:t xml:space="preserve"> </w:t>
+      </w:r>
+      <w:r>
+        <w:t xml:space="preserve">cartels, whose policies are fitted to their partners. The LLM agents here carry no learned state, only the price</w:t>
+      </w:r>
+      <w:r>
+        <w:t xml:space="preserve"> </w:t>
+      </w:r>
+      <w:r>
+        <w:t xml:space="preserve">history in their prompt, so replacing one may not restore competition. We used six markets in the sprint's repeated</w:t>
+      </w:r>
+      <w:r>
+        <w:t xml:space="preserve"> </w:t>
+      </w:r>
+      <w:r>
+        <w:t xml:space="preserve">Bertrand duopoly that crossed a pre-registered high-price threshold: four gemini-2.5-flash markets and two qwen3-14b</w:t>
+      </w:r>
+      <w:r>
+        <w:t xml:space="preserve"> </w:t>
+      </w:r>
+      <w:r>
+        <w:t xml:space="preserve">markets instructed to cooperate. Each was continued for 50 rounds with one or both firms replaced and compared with</w:t>
+      </w:r>
+      <w:r>
+        <w:t xml:space="preserve"> </w:t>
+      </w:r>
+      <w:r>
+        <w:t xml:space="preserve">a no-swap control from the same state, scoring the last 20 rounds. Replacing one firm with a same-family model,</w:t>
       </w:r>
       <w:r>
         <w:t xml:space="preserve"> </w:t>
@@ -101,37 +101,37 @@
         <w:t xml:space="preserve"> </w:t>
       </w:r>
       <w:r>
-        <w:t xml:space="preserve">6 of 8 continuations. In exploratory arms, two current models undercut the incumbent, lowering the index further:</w:t>
-      </w:r>
-      <w:r>
-        <w:t xml:space="preserve"> </w:t>
-      </w:r>
-      <w:r>
-        <w:t xml:space="preserve">Claude Haiku 5.5 by 0.30 (95% CI 0.15 to 0.44) and GPT-5.6 Sol by 0.40 (0.21 to 0.58), although on the</w:t>
-      </w:r>
-      <w:r>
-        <w:t xml:space="preserve"> </w:t>
-      </w:r>
-      <w:r>
-        <w:t xml:space="preserve">pre-registered from-scratch measure each kept high prices in 1 of 4 markets, as gpt-4.1 did. Four added markets gave</w:t>
-      </w:r>
-      <w:r>
-        <w:t xml:space="preserve"> </w:t>
-      </w:r>
-      <w:r>
-        <w:t xml:space="preserve">the same conclusions, and no continuation's scored average returned to the competitive price. Replacing an agent</w:t>
-      </w:r>
-      <w:r>
-        <w:t xml:space="preserve"> </w:t>
-      </w:r>
-      <w:r>
-        <w:t xml:space="preserve">cannot be assumed to end high prices, and evaluations should test how an incoming agent behaves in a market that</w:t>
-      </w:r>
-      <w:r>
-        <w:t xml:space="preserve"> </w:t>
-      </w:r>
-      <w:r>
-        <w:t xml:space="preserve">already has them, as well as whether it colludes from scratch.</w:t>
+        <w:t xml:space="preserve">6 of 8 continuations. In exploratory arms, two current models undercut the incumbent, lowering the index: Claude</w:t>
+      </w:r>
+      <w:r>
+        <w:t xml:space="preserve"> </w:t>
+      </w:r>
+      <w:r>
+        <w:t xml:space="preserve">Haiku 5.5 by 0.30 (95% CI 0.15 to 0.44) and GPT-5.6 Sol by 0.40 (0.21 to 0.58). Yet on the pre-registered</w:t>
+      </w:r>
+      <w:r>
+        <w:t xml:space="preserve"> </w:t>
+      </w:r>
+      <w:r>
+        <w:t xml:space="preserve">from-scratch measure each kept high prices in 1 of 4 markets, as gpt-4.1 did. Four added markets gave the same</w:t>
+      </w:r>
+      <w:r>
+        <w:t xml:space="preserve"> </w:t>
+      </w:r>
+      <w:r>
+        <w:t xml:space="preserve">conclusions, and no continuation's scored average returned to the competitive price. Replacing an agent cannot be</w:t>
+      </w:r>
+      <w:r>
+        <w:t xml:space="preserve"> </w:t>
+      </w:r>
+      <w:r>
+        <w:t xml:space="preserve">assumed to end high prices; evaluations should test how an incoming agent behaves in a market that already has them,</w:t>
+      </w:r>
+      <w:r>
+        <w:t xml:space="preserve"> </w:t>
+      </w:r>
+      <w:r>
+        <w:t xml:space="preserve">as well as whether it colludes from scratch.</w:t>
       </w:r>
     </w:p>
     <w:bookmarkStart w:id="13" w:name="introduction"/>
@@ -160,7 +160,7 @@
         <w:t xml:space="preserve"> </w:t>
       </w:r>
       <w:r>
-        <w:t xml:space="preserve">obvious remedy is to replace the algorithm, by regulatory order or a change of vendor. For reinforcement-learning</w:t>
+        <w:t xml:space="preserve">obvious remedy is to replace the algorithm, by regulatory order or a change of vendor. In simulations of reinforcement-learning</w:t>
       </w:r>
       <w:r>
         <w:t xml:space="preserve"> </w:t>
@@ -3065,7 +3065,7 @@
         <w:t xml:space="preserve"> </w:t>
       </w:r>
       <w:r>
-        <w:t xml:space="preserve">A swap breaks Q-learning collusion because each policy is fitted to its partner</w:t>
+        <w:t xml:space="preserve">In Q-learning simulations a swap breaks collusion because each policy is fitted to its partner</w:t>
       </w:r>
       <w:r>
         <w:t xml:space="preserve"> </w:t>
@@ -3233,7 +3233,7 @@
         <w:pStyle w:val="FirstParagraph"/>
       </w:pPr>
       <w:r>
-        <w:t xml:space="preserve">In this harness, replacing a pricing agent, the remedy that breaks Q-learning cartels, did not restore competitive</w:t>
+        <w:t xml:space="preserve">In this harness, replacing a pricing agent, the remedy that breaks simulated Q-learning cartels, did not restore competitive</w:t>
       </w:r>
       <w:r>
         <w:t xml:space="preserve"> </w:t>

</xml_diff>

<commit_message>
LLM usage statement: reword assistant's role
</commit_message>
<xml_diff>
--- a/report/report.docx
+++ b/report/report.docx
@@ -11317,13 +11317,13 @@
         <w:t xml:space="preserve"> </w:t>
       </w:r>
       <w:r>
-        <w:t xml:space="preserve">reviewed the work. An AI coding assistant (Claude) was used to implement the pipeline and analysis code, to draft</w:t>
-      </w:r>
-      <w:r>
-        <w:t xml:space="preserve"> </w:t>
-      </w:r>
-      <w:r>
-        <w:t xml:space="preserve">and revise the text, to write the classifier's 20 reference labels (Appendix A) and to check the draft and the</w:t>
+        <w:t xml:space="preserve">reviewed the work. An AI coding assistant (Claude) was used to implement the pipeline and analysis code, to help</w:t>
+      </w:r>
+      <w:r>
+        <w:t xml:space="preserve"> </w:t>
+      </w:r>
+      <w:r>
+        <w:t xml:space="preserve">write the text, to write the classifier's 20 reference labels (Appendix A) and to check the draft and the</w:t>
       </w:r>
       <w:r>
         <w:t xml:space="preserve"> </w:t>

</xml_diff>